<commit_message>
Issue #83: split services with HTTPS ports + update deployment artifacts
- Added network_split diagram/table and refreshed deployment diagrams. - Added frontend Nginx proxy config and HTTPS serving; updated docker-compose networks and port mappings (frontend 443, pgAdmin 8443, backend/db internal). - Added self-signed certs for local TLS. - Added new building/street Excel templates and updated Stage A rehearsal/submission docs.
</commit_message>
<xml_diff>
--- a/docs/Stage A submission/StageA_Submission.docx
+++ b/docs/Stage A submission/StageA_Submission.docx
@@ -1104,7 +1104,7 @@
         <w:pStyle w:val="ListBullet"/>
       </w:pPr>
       <w:r>
-        <w:t>- Temporary client testing host: team PC kept online with No‑IP + port‑forwarding (external HTTP 80 → internal 8080; PostgreSQL 5432; pgAdmin 8081).</w:t>
+        <w:t>- Temporary client testing host: team PC kept online with No‑IP + port‑forwarding (external HTTP 80 → frontend 8082; backend API internal 8080; PostgreSQL 5432; pgAdmin 8081).</w:t>
       </w:r>
     </w:p>
     <w:p>
@@ -1968,7 +1968,7 @@
     </w:p>
     <w:p>
       <w:r>
-        <w:t>Current temporary hosting on team PC with No‑IP + port‑forwarding (external HTTP 80 → internal 8080; PostgreSQL 5432; pgAdmin 8081).</w:t>
+        <w:t>Current temporary hosting on team PC with No‑IP + port‑forwarding (external HTTP 80 → frontend 8082; backend API internal 8080; PostgreSQL 5432; pgAdmin 8081).</w:t>
       </w:r>
     </w:p>
     <w:sectPr>

</xml_diff>

<commit_message>
Issue #75: update Stage A docs, deployment diagrams, and remove IsDeleted
</commit_message>
<xml_diff>
--- a/docs/Stage A submission/StageA_Submission.docx
+++ b/docs/Stage A submission/StageA_Submission.docx
@@ -6,33 +6,23 @@
       <w:pPr>
         <w:pStyle w:val="Title"/>
         <w:pageBreakBefore/>
+        <w:jc w:val="center"/>
       </w:pPr>
-      <w:r>
-        <w:t xml:space="preserve">Stage A Submission – </w:t>
-      </w:r>
       <w:proofErr w:type="spellStart"/>
       <w:r>
         <w:t>GhostHouses</w:t>
       </w:r>
       <w:proofErr w:type="spellEnd"/>
-    </w:p>
-    <w:p>
       <w:r>
-        <w:t>Date: 2026-01-23</w:t>
+        <w:t xml:space="preserve"> - </w:t>
       </w:r>
       <w:r>
-        <w:br/>
-        <w:t>Repository: https://github.com/bbdaria/GhostHouses</w:t>
+        <w:t>Stage A</w:t>
       </w:r>
     </w:p>
     <w:p>
       <w:r>
-        <w:t>This document addresses the Stage A requirements from the course staff and summarizes the current system state, implemented features, and remaining work.</w:t>
-      </w:r>
-    </w:p>
-    <w:p>
-      <w:r>
-        <w:br w:type="page"/>
+        <w:t>Repository: https://github.com/bbdaria/GhostHouses</w:t>
       </w:r>
     </w:p>
     <w:p>
@@ -47,7 +37,22 @@
     </w:p>
     <w:p>
       <w:r>
-        <w:t>The original HLD defined 16 user stories. We currently track 17 User Story issues: the original 16 plus one added after HLD.</w:t>
+        <w:t>The original HLD defined 16 user stories. We now track 17 User Story issues: the original 16 plus one added after HLD (US‑17 export buildings table to Excel for backup/restore, Issue #76).</w:t>
+      </w:r>
+    </w:p>
+    <w:p>
+      <w:r>
+        <w:t>Canceled per requirement change: US‑14 Delete log entries (logs are immutable) and US‑13 Add/edit log entries (logs are auto‑generated and immutable).</w:t>
+      </w:r>
+    </w:p>
+    <w:p>
+      <w:r>
+        <w:t>Additional scope since HLD: multi‑select building card export (Issue #74) and expanded import/export workflows + template converter.</w:t>
+      </w:r>
+    </w:p>
+    <w:p>
+      <w:r>
+        <w:t>Current status: core workflows are Done. Backlog items for Stage B are US‑2 2FA integration, US‑3 admin permission management, US‑7 building‑card template update, and US‑16 external system sync.</w:t>
       </w:r>
     </w:p>
     <w:tbl>
@@ -183,7 +188,7 @@
           </w:tcPr>
           <w:p>
             <w:r>
-              <w:t>Issue #21 open – OTP flow exists; real OTP integration pending (#4).</w:t>
+              <w:t>Issue #21 open – OTP flow exists, real OTP integration pending (#4).</w:t>
             </w:r>
           </w:p>
         </w:tc>
@@ -225,7 +230,7 @@
           </w:tcPr>
           <w:p>
             <w:r>
-              <w:t>Issue #22 open – role gates exist; final admin controls pending.</w:t>
+              <w:t>Issue #22 open – role gates exist, final admin controls pending.</w:t>
             </w:r>
           </w:p>
         </w:tc>
@@ -398,15 +403,7 @@
           </w:tcPr>
           <w:p>
             <w:r>
-              <w:t xml:space="preserve">Issue #26 open only for template </w:t>
-            </w:r>
-            <w:proofErr w:type="gramStart"/>
-            <w:r>
-              <w:t>updates (#</w:t>
-            </w:r>
-            <w:proofErr w:type="gramEnd"/>
-            <w:r>
-              <w:t>82).</w:t>
+              <w:t>Issue #26 open only for template updates (#82).</w:t>
             </w:r>
           </w:p>
         </w:tc>
@@ -658,15 +655,7 @@
           </w:tcPr>
           <w:p>
             <w:r>
-              <w:t>Issue #32 closed (</w:t>
-            </w:r>
-            <w:proofErr w:type="gramStart"/>
-            <w:r>
-              <w:t>logs auto‑generated</w:t>
-            </w:r>
-            <w:proofErr w:type="gramEnd"/>
-            <w:r>
-              <w:t xml:space="preserve"> from changes).</w:t>
+              <w:t>Issue #32 closed (logs auto‑generated from changes).</w:t>
             </w:r>
           </w:p>
         </w:tc>
@@ -708,7 +697,11 @@
           </w:tcPr>
           <w:p>
             <w:r>
-              <w:t>Requirement removed; logs are immutable (Issue #73).</w:t>
+              <w:t xml:space="preserve">Requirement </w:t>
+            </w:r>
+            <w:r>
+              <w:lastRenderedPageBreak/>
+              <w:t>removed, logs are immutable (Issue #73).</w:t>
             </w:r>
           </w:p>
         </w:tc>
@@ -720,6 +713,7 @@
           </w:tcPr>
           <w:p>
             <w:r>
+              <w:lastRenderedPageBreak/>
               <w:t>US-15</w:t>
             </w:r>
           </w:p>
@@ -792,15 +786,7 @@
           </w:tcPr>
           <w:p>
             <w:r>
-              <w:t xml:space="preserve">Issue #35 </w:t>
-            </w:r>
-            <w:proofErr w:type="gramStart"/>
-            <w:r>
-              <w:t>open (#5, #</w:t>
-            </w:r>
-            <w:proofErr w:type="gramEnd"/>
-            <w:r>
-              <w:t>78).</w:t>
+              <w:t>Issue #35 open (#5, #78).</w:t>
             </w:r>
           </w:p>
         </w:tc>
@@ -842,51 +828,12 @@
           </w:tcPr>
           <w:p>
             <w:r>
-              <w:t>Added after HLD; Issue #76 closed.</w:t>
+              <w:t>Added after HLD, Issue #76 closed.</w:t>
             </w:r>
           </w:p>
         </w:tc>
       </w:tr>
     </w:tbl>
-    <w:p>
-      <w:r>
-        <w:t>Changes from HLD:</w:t>
-      </w:r>
-    </w:p>
-    <w:p>
-      <w:r>
-        <w:lastRenderedPageBreak/>
-        <w:t>- US-14 (Delete logs) was removed per client request; logs are immutable and audit‑grade.</w:t>
-      </w:r>
-    </w:p>
-    <w:p>
-      <w:r>
-        <w:t>- Added after HLD: US-17 Export buildings table to Excel for backup/restore (Issue #76).</w:t>
-      </w:r>
-    </w:p>
-    <w:p>
-      <w:r>
-        <w:t>- Added use case</w:t>
-      </w:r>
-      <w:proofErr w:type="gramStart"/>
-      <w:r>
-        <w:t>: multi‑select</w:t>
-      </w:r>
-      <w:proofErr w:type="gramEnd"/>
-      <w:r>
-        <w:t xml:space="preserve"> buildings and export multiple building cards to a PPTX deck (implemented, Issue #74).</w:t>
-      </w:r>
-    </w:p>
-    <w:p>
-      <w:r>
-        <w:t>- Import/Export workflows and template converter were expanded beyond the original HLD scope.</w:t>
-      </w:r>
-    </w:p>
-    <w:p>
-      <w:r>
-        <w:br w:type="page"/>
-      </w:r>
-    </w:p>
     <w:p>
       <w:pPr>
         <w:pStyle w:val="Heading1"/>
@@ -941,20 +888,12 @@
     </w:p>
     <w:p>
       <w:r>
-        <w:t xml:space="preserve">Layered architecture: Controllers → Services → Data → Models. Planned components (external sync) are </w:t>
-      </w:r>
-      <w:proofErr w:type="gramStart"/>
-      <w:r>
-        <w:t>marked in</w:t>
-      </w:r>
-      <w:proofErr w:type="gramEnd"/>
-      <w:r>
-        <w:t xml:space="preserve"> yellow; implemented components are green.</w:t>
+        <w:t>Layered architecture: Controllers → Services → Data → Models. Planned components (external sync) are marked in yellow, implemented components are green.</w:t>
       </w:r>
     </w:p>
     <w:p>
       <w:r>
-        <w:t>Arrow legend: A → B means A uses/depends on B; A &lt;|– B means inheritance; 1→* indicates one‑to‑many relationships. Incoming arrows mean others depend on this component; outgoing arrows mean it depends on others.</w:t>
+        <w:t>Arrow legend: A → B means A uses/depends on B, A &lt;|– B means inheritance, 1→* indicates one‑to‑many relationships. Incoming arrows mean others depend on this component, outgoing arrows mean it depends on others.</w:t>
       </w:r>
     </w:p>
     <w:p>
@@ -991,15 +930,7 @@
         <w:pStyle w:val="ListBullet"/>
       </w:pPr>
       <w:r>
-        <w:t xml:space="preserve">Data layer: EF Core </w:t>
-      </w:r>
-      <w:proofErr w:type="spellStart"/>
-      <w:r>
-        <w:t>DbContext</w:t>
-      </w:r>
-      <w:proofErr w:type="spellEnd"/>
-      <w:r>
-        <w:t>, migrations, and import utilities; uses LINQ (C# query syntax) instead of raw SQL.</w:t>
+        <w:t>Data layer: EF Core DbContext, migrations, and import utilities, uses LINQ (C# query syntax) instead of raw SQL.</w:t>
       </w:r>
     </w:p>
     <w:p>
@@ -1039,41 +970,59 @@
       </w:r>
     </w:p>
     <w:p>
+      <w:pPr>
+        <w:pStyle w:val="ListBullet"/>
+      </w:pPr>
       <w:r>
-        <w:t>- Clear separation of backend/frontend (`project/</w:t>
-      </w:r>
-      <w:proofErr w:type="gramStart"/>
-      <w:r>
-        <w:t>web-server</w:t>
-      </w:r>
-      <w:proofErr w:type="gramEnd"/>
-      <w:r>
-        <w:t>`).</w:t>
+        <w:t>Clear separation of backend/frontend (`project/web-server`).</w:t>
       </w:r>
     </w:p>
     <w:p>
+      <w:pPr>
+        <w:pStyle w:val="ListBullet"/>
+      </w:pPr>
       <w:r>
-        <w:t>- Documentation stored under `docs/` (HLD, architecture, conventions, submissions).</w:t>
+        <w:t>Documentation stored under `docs/` (HLD, architecture, conventions, submissions).</w:t>
       </w:r>
     </w:p>
     <w:p>
+      <w:pPr>
+        <w:pStyle w:val="ListBullet"/>
+      </w:pPr>
       <w:r>
-        <w:t>- Issue workflow with branch naming `Issues/#&lt;number&gt;-&lt;slug&gt;` and one issue per branch.</w:t>
+        <w:t>Issue workflow with branch naming `Issues/#&lt;number&gt;-&lt;slug&gt;` and one issue per branch.</w:t>
       </w:r>
     </w:p>
     <w:p>
+      <w:pPr>
+        <w:pStyle w:val="ListBullet"/>
+      </w:pPr>
       <w:r>
-        <w:t>- Issue guard workflow comments on missing metadata (milestone, labels, parent story) and rule violations.</w:t>
+        <w:t>Issue guard workflow comments on missing metadata (milestone, labels, parent story) and rule violations.</w:t>
       </w:r>
     </w:p>
     <w:p>
+      <w:pPr>
+        <w:pStyle w:val="ListBullet"/>
+      </w:pPr>
       <w:r>
-        <w:t>- Tests live under `tests/` (currently minimal smoke tests).</w:t>
+        <w:t>Tests live under `tests/` (currently minimal smoke tests).</w:t>
       </w:r>
     </w:p>
     <w:p>
+      <w:pPr>
+        <w:pStyle w:val="ListBullet"/>
+      </w:pPr>
       <w:r>
-        <w:br w:type="page"/>
+        <w:t>Issue guard runs on issue events and daily (scheduled) to catch drift automatically.</w:t>
+      </w:r>
+    </w:p>
+    <w:p>
+      <w:pPr>
+        <w:pStyle w:val="ListBullet"/>
+      </w:pPr>
+      <w:r>
+        <w:t>Issue guard checks project status, parent story, and branch linkage in addition to labels/milestones.</w:t>
       </w:r>
     </w:p>
     <w:p>
@@ -1096,7 +1045,7 @@
         <w:pStyle w:val="ListBullet"/>
       </w:pPr>
       <w:r>
-        <w:t>- Application is built and run locally via Docker Compose.</w:t>
+        <w:t>Application is built and run locally via Docker Compose.</w:t>
       </w:r>
     </w:p>
     <w:p>
@@ -1104,7 +1053,12 @@
         <w:pStyle w:val="ListBullet"/>
       </w:pPr>
       <w:r>
-        <w:t>- Temporary client testing host: team PC kept online with No‑IP + port‑forwarding (external HTTP 80 → frontend 8082; backend API internal 8080; PostgreSQL 5432; pgAdmin 8081).</w:t>
+        <w:t>Temporary client testing host: team PC kept online with No‑IP + port‑forwarding (external HTTPS 443 → frontend 443, backend internal 8080, PostgreSQL 5432, pgAdmin HTTPS 8443). Client access: https://ghosthouses.myddns.me/.</w:t>
+      </w:r>
+    </w:p>
+    <w:p>
+      <w:r>
+        <w:t>Current port layout: Frontend HTTPS 443 (public), backend internal 8080 (not exposed), PostgreSQL 5432 (internal), pgAdmin HTTPS 8443 (admin‑only).</w:t>
       </w:r>
     </w:p>
     <w:p>
@@ -1112,7 +1066,15 @@
         <w:pStyle w:val="ListBullet"/>
       </w:pPr>
       <w:r>
-        <w:t>- Issue‑guard workflow exists for metadata enforcement.</w:t>
+        <w:t>Network isolation: app-net (frontend↔backend), db-net (backend↔db), admin-net (pgAdmin↔db).</w:t>
+      </w:r>
+    </w:p>
+    <w:p>
+      <w:pPr>
+        <w:pStyle w:val="ListBullet"/>
+      </w:pPr>
+      <w:r>
+        <w:t>Issue‑guard workflow exists for metadata enforcement.</w:t>
       </w:r>
     </w:p>
     <w:p>
@@ -1125,7 +1087,7 @@
         <w:pStyle w:val="ListBullet"/>
       </w:pPr>
       <w:r>
-        <w:t>- Add CI pipeline for build + tests on PR/merge.</w:t>
+        <w:t>Add CI pipeline for build + tests on PR/merge.</w:t>
       </w:r>
     </w:p>
     <w:p>
@@ -1133,7 +1095,7 @@
         <w:pStyle w:val="ListBullet"/>
       </w:pPr>
       <w:r>
-        <w:t>- Deploy to client Windows Server with HTTPS once IT provides the environment (Issue #78).</w:t>
+        <w:t>Deploy to client Windows Server with HTTPS once IT provides the environment (Issue #78).</w:t>
       </w:r>
     </w:p>
     <w:p>
@@ -1146,15 +1108,7 @@
         <w:pStyle w:val="ListBullet"/>
       </w:pPr>
       <w:r>
-        <w:t xml:space="preserve">- Same as HLD: GitHub workflow (dev for ongoing work, main for stable releases) and a </w:t>
-      </w:r>
-      <w:proofErr w:type="spellStart"/>
-      <w:r>
-        <w:t>Dockerized</w:t>
-      </w:r>
-      <w:proofErr w:type="spellEnd"/>
-      <w:r>
-        <w:t xml:space="preserve"> stack.</w:t>
+        <w:t>Same as HLD: GitHub workflow (dev for ongoing work, main for stable releases) and a Dockerized stack.</w:t>
       </w:r>
     </w:p>
     <w:p>
@@ -1162,7 +1116,7 @@
         <w:pStyle w:val="ListBullet"/>
       </w:pPr>
       <w:r>
-        <w:t>- Changed: official Windows Server deployment is delayed; a temporary host is used to keep client testing active.</w:t>
+        <w:t>Changed: official Windows Server deployment is delayed, a temporary host is used to keep client testing active.</w:t>
       </w:r>
     </w:p>
     <w:p>
@@ -1195,7 +1149,7 @@
         <w:pStyle w:val="ListBullet"/>
       </w:pPr>
       <w:r>
-        <w:t>- Single source of truth for Buildings/Streets rules shared by add/edit/import/export.</w:t>
+        <w:t>Single source of truth for Buildings/Streets rules shared by add/edit/import/export.</w:t>
       </w:r>
     </w:p>
     <w:p>
@@ -1203,7 +1157,7 @@
         <w:pStyle w:val="ListBullet"/>
       </w:pPr>
       <w:r>
-        <w:t>- Immutable logs (audit‑grade).</w:t>
+        <w:t>Immutable logs (audit‑grade).</w:t>
       </w:r>
     </w:p>
     <w:p>
@@ -1211,7 +1165,7 @@
         <w:pStyle w:val="ListBullet"/>
       </w:pPr>
       <w:r>
-        <w:t>- New strict template is the only accepted import format.</w:t>
+        <w:t>New strict template is the only accepted import format.</w:t>
       </w:r>
     </w:p>
     <w:p>
@@ -1219,7 +1173,15 @@
         <w:pStyle w:val="ListBullet"/>
       </w:pPr>
       <w:r>
-        <w:t>- Temporary converter maps legacy files to the new template; validation is enforced on import.</w:t>
+        <w:t>Temporary converter maps legacy files to the new template, validation is enforced on import.</w:t>
+      </w:r>
+    </w:p>
+    <w:p>
+      <w:pPr>
+        <w:pStyle w:val="ListBullet"/>
+      </w:pPr>
+      <w:r>
+        <w:t>Import uses staged validation and conflict resolution (missing required fields first, then duplicates).</w:t>
       </w:r>
     </w:p>
     <w:p>
@@ -1232,15 +1194,7 @@
         <w:pStyle w:val="ListBullet"/>
       </w:pPr>
       <w:r>
-        <w:t xml:space="preserve">- Reliable, production‑grade </w:t>
-      </w:r>
-      <w:proofErr w:type="gramStart"/>
-      <w:r>
-        <w:t>import</w:t>
-      </w:r>
-      <w:proofErr w:type="gramEnd"/>
-      <w:r>
-        <w:t xml:space="preserve"> with staged validation and conflict resolution.</w:t>
+        <w:t>Reliable, production‑grade import with staged validation and conflict resolution.</w:t>
       </w:r>
     </w:p>
     <w:p>
@@ -1261,6 +1215,11 @@
     <w:p>
       <w:r>
         <w:t>Primary risk: deployment on the client’s Windows Server with unknown infrastructure and external system integrations. This affects OTP, API connectivity, and production configuration. Mitigation: early coordination with client IT, containerized deployment plan, and API contract definition.</w:t>
+      </w:r>
+    </w:p>
+    <w:p>
+      <w:r>
+        <w:t>Short‑term mitigation includes mock adapters for external APIs and temporary client testing (No‑IP + port‑forwarding) until IT provides the official Windows Server environment.</w:t>
       </w:r>
     </w:p>
     <w:p>
@@ -1370,7 +1329,7 @@
           </w:tcPr>
           <w:p>
             <w:r>
-              <w:t>Define deployment plan with client IT; test pilot deployment</w:t>
+              <w:t>Define deployment plan with client IT, test pilot deployment</w:t>
             </w:r>
           </w:p>
         </w:tc>
@@ -1422,7 +1381,7 @@
           </w:tcPr>
           <w:p>
             <w:r>
-              <w:t>Define external API contracts; build mocks/adapters</w:t>
+              <w:t>Define external API contracts, build mocks/adapters</w:t>
             </w:r>
           </w:p>
         </w:tc>
@@ -1474,7 +1433,7 @@
           </w:tcPr>
           <w:p>
             <w:r>
-              <w:t>Integrate OTP with client provider; maintain fallback</w:t>
+              <w:t>Integrate OTP with client provider, maintain fallback</w:t>
             </w:r>
           </w:p>
         </w:tc>
@@ -1628,6 +1587,10 @@
       <w:r>
         <w:t>All remaining open items are in Stage B.</w:t>
       </w:r>
+      <w:r>
+        <w:br/>
+        <w:t>Backlog should be reviewed in the GitHub Project board (visual view).</w:t>
+      </w:r>
     </w:p>
     <w:p>
       <w:r>
@@ -1639,7 +1602,7 @@
         <w:pStyle w:val="ListBullet"/>
       </w:pPr>
       <w:r>
-        <w:t>- #4 Real OTP integration</w:t>
+        <w:t>#4 Real OTP integration</w:t>
       </w:r>
     </w:p>
     <w:p>
@@ -1647,7 +1610,7 @@
         <w:pStyle w:val="ListBullet"/>
       </w:pPr>
       <w:r>
-        <w:t>- #5 External data sources integration</w:t>
+        <w:t>#5 External data sources integration</w:t>
       </w:r>
     </w:p>
     <w:p>
@@ -1655,15 +1618,7 @@
         <w:pStyle w:val="ListBullet"/>
       </w:pPr>
       <w:r>
-        <w:t xml:space="preserve">- #78 Deployment </w:t>
-      </w:r>
-      <w:proofErr w:type="gramStart"/>
-      <w:r>
-        <w:t>on</w:t>
-      </w:r>
-      <w:proofErr w:type="gramEnd"/>
-      <w:r>
-        <w:t xml:space="preserve"> client Windows Server</w:t>
+        <w:t>#78 Deployment on client Windows Server</w:t>
       </w:r>
     </w:p>
     <w:p>
@@ -1671,7 +1626,7 @@
         <w:pStyle w:val="ListBullet"/>
       </w:pPr>
       <w:r>
-        <w:t>- #82 Building card template update (awaiting client)</w:t>
+        <w:t>#82 Building card template update (awaiting client)</w:t>
       </w:r>
     </w:p>
     <w:p>
@@ -1684,7 +1639,7 @@
         <w:pStyle w:val="ListBullet"/>
       </w:pPr>
       <w:r>
-        <w:t>- US‑2 2FA login</w:t>
+        <w:t>US‑2 2FA login</w:t>
       </w:r>
     </w:p>
     <w:p>
@@ -1692,7 +1647,7 @@
         <w:pStyle w:val="ListBullet"/>
       </w:pPr>
       <w:r>
-        <w:t>- US‑3 Permissions</w:t>
+        <w:t>US‑3 Permissions</w:t>
       </w:r>
     </w:p>
     <w:p>
@@ -1700,7 +1655,7 @@
         <w:pStyle w:val="ListBullet"/>
       </w:pPr>
       <w:r>
-        <w:t>- US‑7 Building card export (template update)</w:t>
+        <w:t>US‑7 Building card export (template update)</w:t>
       </w:r>
     </w:p>
     <w:p>
@@ -1708,7 +1663,7 @@
         <w:pStyle w:val="ListBullet"/>
       </w:pPr>
       <w:r>
-        <w:t>- US‑16 External system sync</w:t>
+        <w:t>US‑16 External system sync</w:t>
       </w:r>
     </w:p>
     <w:p>
@@ -1832,7 +1787,7 @@
     </w:p>
     <w:p>
       <w:r>
-        <w:t>Implementation‑accurate class diagram; planned components are marked separately.</w:t>
+        <w:t>Implementation‑accurate class diagram, planned components are marked separately.</w:t>
       </w:r>
     </w:p>
     <w:p>
@@ -1856,9 +1811,9 @@
           <w:noProof/>
         </w:rPr>
         <w:drawing>
-          <wp:inline distT="0" distB="0" distL="0" distR="0" wp14:anchorId="218C42F0" wp14:editId="1CF0BB12">
-            <wp:extent cx="5486400" cy="2780778"/>
-            <wp:effectExtent l="0" t="0" r="0" b="0"/>
+          <wp:inline distT="0" distB="0" distL="0" distR="0" wp14:anchorId="218C42F0" wp14:editId="7436FDAD">
+            <wp:extent cx="6088380" cy="2623457"/>
+            <wp:effectExtent l="0" t="0" r="7620" b="5715"/>
             <wp:docPr id="12" name="Picture 12"/>
             <wp:cNvGraphicFramePr>
               <a:graphicFrameLocks xmlns:a="http://schemas.openxmlformats.org/drawingml/2006/main" noChangeAspect="1"/>
@@ -1879,7 +1834,7 @@
                   <pic:spPr>
                     <a:xfrm>
                       <a:off x="0" y="0"/>
-                      <a:ext cx="5486400" cy="2780778"/>
+                      <a:ext cx="6101129" cy="2628951"/>
                     </a:xfrm>
                     <a:prstGeom prst="rect">
                       <a:avLst/>
@@ -1894,17 +1849,22 @@
     </w:p>
     <w:p>
       <w:r>
-        <w:t>Target deployment: municipality users access the Frontend over HTTPS; Frontend calls Backend; Backend connects to PostgreSQL, Auth Server, and municipal services inside the network.</w:t>
+        <w:t>Target deployment: municipality users access the Frontend over HTTPS, Frontend calls Backend, Backend connects to PostgreSQL, Auth Server, and municipal services inside the network.</w:t>
       </w:r>
     </w:p>
     <w:p>
       <w:r>
-        <w:t>Docker containers: frontend + backend run in containers on the web server; PostgreSQL + pgAdmin run in containers on the database server.</w:t>
+        <w:t>Docker containers: frontend + backend run in containers on the web server, PostgreSQL + pgAdmin run in containers on the database server.</w:t>
       </w:r>
     </w:p>
     <w:p>
+      <w:proofErr w:type="spellStart"/>
       <w:r>
-        <w:t>pgAdmin is for municipality IT/DB admins only (not end users).</w:t>
+        <w:t>pgAdmin</w:t>
+      </w:r>
+      <w:proofErr w:type="spellEnd"/>
+      <w:r>
+        <w:t xml:space="preserve"> is for municipality IT/DB admins only (not end users).</w:t>
       </w:r>
     </w:p>
     <w:p/>
@@ -1930,8 +1890,8 @@
           <w:noProof/>
         </w:rPr>
         <w:drawing>
-          <wp:inline distT="0" distB="0" distL="0" distR="0" wp14:anchorId="699E3A27" wp14:editId="003ED33E">
-            <wp:extent cx="6095007" cy="1990725"/>
+          <wp:inline distT="0" distB="0" distL="0" distR="0" wp14:anchorId="699E3A27" wp14:editId="19282157">
+            <wp:extent cx="6094730" cy="1524000"/>
             <wp:effectExtent l="0" t="0" r="1270" b="0"/>
             <wp:docPr id="10" name="Picture 10"/>
             <wp:cNvGraphicFramePr>
@@ -1953,7 +1913,7 @@
                   <pic:spPr>
                     <a:xfrm>
                       <a:off x="0" y="0"/>
-                      <a:ext cx="6209816" cy="2028223"/>
+                      <a:ext cx="6215013" cy="1554077"/>
                     </a:xfrm>
                     <a:prstGeom prst="rect">
                       <a:avLst/>
@@ -1968,7 +1928,7 @@
     </w:p>
     <w:p>
       <w:r>
-        <w:t>Current temporary hosting on team PC with No‑IP + port‑forwarding (external HTTP 80 → frontend 8082; backend API internal 8080; PostgreSQL 5432; pgAdmin 8081).</w:t>
+        <w:t>Current temporary hosting on team PC with No‑IP DNS (https://ghosthouses.myddns.me) and port‑forwarding (external HTTPS 443 → frontend 443, backend API internal 8080, PostgreSQL 5432, pgAdmin HTTPS 8443). Network split mirrors the desired setup: app‑net (frontend ↔ backend), db‑net (backend ↔ DB), admin‑net (pgAdmin ↔ DB).</w:t>
       </w:r>
     </w:p>
     <w:sectPr>

</xml_diff>